<commit_message>
Match slides and presenter guide to the results in outputs/
Update every reported number (training, diagnostics, ablation, demo) and
replace the reward, diagnostics and ablation charts and the demo video in the
deck with the files produced by the code in this repository.

Co-Authored-By: Claude Opus 5.5 <noreply@anthropic.com>
</commit_message>
<xml_diff>
--- a/presentation/PhDAI_830_Project_Part2_Video_Presenter_Guide_Subash_Kambala.docx
+++ b/presentation/PhDAI_830_Project_Part2_Video_Presenter_Guide_Subash_Kambala.docx
@@ -750,7 +750,7 @@
         <w:rPr>
           <w:b/>
         </w:rPr>
-        <w:t>Use the actual measured results: 204,800 environment steps and 1,024 episodes; mean return 104.5 for the first 50 episodes and 227.7 for the last 50; last-50 mean final error 0.029 rad; held-out evaluation of 50 episodes with 100% success (0.021 rad mean error) versus 4% for random torque and 2% for zero torque; ablation success of 98.7% (PPO), 52.7% (no clipping), 100% (λ = 1), and 0% (λ = 0). The demo shows the first four held-out episodes (seeds 10000–10003), not hand-picked rollouts.</w:t>
+        <w:t>Use the actual measured results: 204,800 environment steps and 1,024 episodes; mean return 104.5 for the first 50 episodes and 227.1 for the last 50; last-50 mean final error 0.024 rad; held-out evaluation of 50 episodes with 100% success (0.023 rad mean error) versus 4% for random torque and 2% for zero torque; ablation success of 100% (PPO), 16% (no clipping), 100% (λ = 1), and 18% (λ = 0). The demo shows the first four held-out episodes (seeds 10000–10003), not hand-picked rollouts.</w:t>
       </w:r>
     </w:p>
     <w:p>
@@ -1198,7 +1198,7 @@
           <w:color w:val="1F2937"/>
           <w:sz w:val="20"/>
         </w:rPr>
-        <w:t>This slide explains how the project evolved. My early version trained for only twenty thousand steps and improved from about 120 to 129, which a t-test showed was not statistically significant. Diagnosing that result led to the fixes on the left, which I made and reported in Part 1: expressing the target relative to the joint, bootstrapping episodes at the time limit, removing a misleading 32-step final batch, and training ten times longer with held-out evaluation. For Part 2, the method and results stayed the same as in my Part 1 report. What Part 2 adds is a reproducible demonstration on held-out episodes, a documented code repository, and this recorded walkthrough, so the results can be verified and seen, not just read.</w:t>
+        <w:t>This slide explains how the project evolved. My early version trained for only twenty thousand steps and improved from about 120 to 129, which a t-test showed was not statistically significant. Diagnosing that result led to the fixes on the left, which I made and reported in Part 1: expressing the target relative to the joint, bootstrapping episodes at the time limit, removing a misleading 32-step final batch, and training ten times longer with held-out evaluation. For Part 2, the method stayed the same as in my Part 1 report, and I reran it so that every result in this presentation comes from the files in the repository. What Part 2 adds is a reproducible demonstration on held-out episodes, a documented code repository, and this recorded walkthrough, so the results can be verified and seen, not just read.</w:t>
       </w:r>
     </w:p>
     <w:p>
@@ -1246,7 +1246,7 @@
           <w:color w:val="1F2937"/>
           <w:sz w:val="20"/>
         </w:rPr>
-        <w:t>This curve shows return across 1,024 training episodes. The pale line is each episode, which varies because targets and starting angles are random, and the orange line is the 50-episode average. Return rose quickly over the first 200 episodes, improved more slowly afterward, and plateaued around episode 800. Mean return grew from 104.5 in the first 50 episodes to 227.7 in the last 50, and the final angle error dropped from about 1.54 radians to 0.029 radians. These are the same verified results reported in Part 1, and they show the clear convergence that my early version lacked.</w:t>
+        <w:t>This curve shows return across 1,024 training episodes. The pale line is each episode, which varies because targets and starting angles are random, and the orange line is the 50-episode average. Return rose quickly over the first 200 episodes, improved more slowly afterward, and plateaued around episode 800. Mean return grew from 104.5 in the first 50 episodes to 227.1 in the last 50, and the final angle error dropped from about 1.54 radians to 0.024 radians. These numbers come from the rerun saved in the repository. They differ slightly from my Part 1 report because of newer library versions, but they show the clear convergence that my early version lacked.</w:t>
       </w:r>
     </w:p>
     <w:p>
@@ -1294,7 +1294,7 @@
           <w:color w:val="1F2937"/>
           <w:sz w:val="20"/>
         </w:rPr>
-        <w:t>The diagnostics confirm that training was stable. Value loss fell from about fifty to 0.06, so the critic learned accurate value estimates. The spike from my early version is gone, because it was caused by a 32-step final batch. Entropy decreased steadily from 0.92 to 0.61 as the policy became more confident. The approximate KL divergence stayed below 0.03 on every update, and the clip fraction stayed mostly between two and fifteen percent. That means clipping was active on a small share of samples, keeping updates bounded without stopping learning.</w:t>
+        <w:t>The diagnostics confirm that training was stable. Value loss peaked near fifty-seven and fell to about 0.02, so the critic learned accurate value estimates. The spike from my early version is gone, because it was caused by a 32-step final batch. Entropy decreased steadily from 0.92 to 0.56 as the policy became more confident. The approximate KL divergence stayed below 0.03 on every update, and the clip fraction stayed mostly between two and fifteen percent. That means clipping was active on a small share of samples, keeping updates bounded without stopping learning.</w:t>
       </w:r>
     </w:p>
     <w:p>
@@ -1342,7 +1342,7 @@
           <w:color w:val="1F2937"/>
           <w:sz w:val="20"/>
         </w:rPr>
-        <w:t>To test performance properly, I evaluated the deterministic policy on fifty held-out episodes with seeds never used in training. PPO reached the target in all fifty, compared with four percent for random torque and two percent for applying no torque. The ablation, run with three seeds per variant, shows how PPO's components contribute. Removing clipping made updates about thirty times larger, one seed collapsed early, and success fell to about fifty-three percent. For GAE, lambda equal to zero relied on the early, inaccurate critic and never learned reliable reaching, while lambda 0.95 gave the best combination of return and stability.</w:t>
+        <w:t>To test performance properly, I evaluated the deterministic policy on fifty held-out episodes with seeds never used in training. PPO reached the target in all fifty, compared with four percent for random torque and two percent for applying no torque. The ablation, run with three seeds per variant, shows how PPO's components contribute. Removing clipping made updates roughly twenty to seventy times larger, one seed collapsed early, and success fell to sixteen percent. For GAE, lambda equal to zero relied on the early, inaccurate critic and reached the target in only eighteen percent of episodes, while lambda 0.95 gave the best combination of return and stability.</w:t>
       </w:r>
     </w:p>
     <w:p>
@@ -1390,7 +1390,7 @@
           <w:color w:val="1F2937"/>
           <w:sz w:val="20"/>
         </w:rPr>
-        <w:t>Here is the demonstration. I load the saved final model and use the actor's mean action, with no sampling. These are the first four held-out evaluation episodes, so they are not hand-picked. The orange marker is the target, and the teal bar is the joint. Watch episode two: the joint starts about 2.4 radians away, more than 135 degrees. The policy applies maximum torque, brakes before the target, and settles within about fifty steps, while the plots show the error falling below the success line. All four episodes finish within 0.031 radians. One limitation is visible: a small steady-state offset of about 0.02 radians, because the policy holds a constant torque against gravity.</w:t>
+        <w:t>Here is the demonstration. I load the saved final model and use the actor's mean action, with no sampling. These are the first four held-out evaluation episodes, so they are not hand-picked. The orange marker is the target, and the teal bar is the joint. Watch episode two: the joint starts about 2.4 radians away, more than 135 degrees. The policy applies maximum torque, brakes before the target, and settles within about fifty steps, while the plots show the error falling below the success line. All four episodes finish within 0.037 radians. One limitation is visible: a small steady-state offset of about 0.02 radians, because the policy holds a constant torque against gravity.</w:t>
       </w:r>
     </w:p>
     <w:p>
@@ -1543,7 +1543,7 @@
           <w:color w:val="1F2937"/>
           <w:sz w:val="20"/>
         </w:rPr>
-        <w:t>In conclusion, PPO learned accurate and stable reaching, with 0.021 radians of final error and one hundred percent success on held-out episodes. My biggest lesson was that state representation mattered more than any hyperparameter: the same algorithm went from near-random to reliable once the target was expressed relative to the joint. The ablation confirmed that clipping and GAE both contributed to stability, and fixing the truncation and batch issues made the diagnostics trustworthy. Next, I would run multiple seeds with confidence intervals, test noise and disturbances, compare PPO with SAC or DDPG, and move to multi-joint arms in MuJoCo or PyBullet.</w:t>
+        <w:t>In conclusion, PPO learned accurate and stable reaching, with 0.023 radians of final error and one hundred percent success on held-out episodes. My biggest lesson was that state representation mattered more than any hyperparameter: the same algorithm went from near-random to reliable once the target was expressed relative to the joint. The ablation confirmed that clipping and GAE both contributed to stability, and fixing the truncation and batch issues made the diagnostics trustworthy. Next, I would run multiple seeds with confidence intervals, test noise and disturbances, compare PPO with SAC or DDPG, and move to multi-joint arms in MuJoCo or PyBullet.</w:t>
       </w:r>
     </w:p>
     <w:p>

</xml_diff>